<commit_message>
Updating documentation (readme and data conversion)
</commit_message>
<xml_diff>
--- a/Data_generation/Documentation/pl4_data_conversion_documentation.docx
+++ b/Data_generation/Documentation/pl4_data_conversion_documentation.docx
@@ -338,7 +338,35 @@
         <w:rPr>
           <w:rFonts w:ascii="Cambria" w:hAnsi="Cambria"/>
         </w:rPr>
-        <w:t xml:space="preserve"> (.cfg and .dat) per .pl4 file converted using the built in GTPPLOT</w:t>
+        <w:t xml:space="preserve"> (.</w:t>
+      </w:r>
+      <w:proofErr w:type="spellStart"/>
+      <w:r>
+        <w:rPr>
+          <w:rFonts w:ascii="Cambria" w:hAnsi="Cambria"/>
+        </w:rPr>
+        <w:t>cfg</w:t>
+      </w:r>
+      <w:proofErr w:type="spellEnd"/>
+      <w:r>
+        <w:rPr>
+          <w:rFonts w:ascii="Cambria" w:hAnsi="Cambria"/>
+        </w:rPr>
+        <w:t xml:space="preserve"> and .</w:t>
+      </w:r>
+      <w:proofErr w:type="spellStart"/>
+      <w:r>
+        <w:rPr>
+          <w:rFonts w:ascii="Cambria" w:hAnsi="Cambria"/>
+        </w:rPr>
+        <w:t>dat</w:t>
+      </w:r>
+      <w:proofErr w:type="spellEnd"/>
+      <w:r>
+        <w:rPr>
+          <w:rFonts w:ascii="Cambria" w:hAnsi="Cambria"/>
+        </w:rPr>
+        <w:t>) per .pl4 file converted using the built in GTPPLOT</w:t>
       </w:r>
       <w:r>
         <w:rPr>
@@ -394,13 +422,41 @@
         <w:rPr>
           <w:rFonts w:ascii="Cambria" w:hAnsi="Cambria"/>
         </w:rPr>
-        <w:t xml:space="preserve">The .dat files will contain the </w:t>
-      </w:r>
-      <w:r>
-        <w:rPr>
-          <w:rFonts w:ascii="Cambria" w:hAnsi="Cambria"/>
-        </w:rPr>
-        <w:t xml:space="preserve">transient waveform data and be much larger than the .cfg configuration files.  </w:t>
+        <w:t>The .</w:t>
+      </w:r>
+      <w:proofErr w:type="spellStart"/>
+      <w:r>
+        <w:rPr>
+          <w:rFonts w:ascii="Cambria" w:hAnsi="Cambria"/>
+        </w:rPr>
+        <w:t>dat</w:t>
+      </w:r>
+      <w:proofErr w:type="spellEnd"/>
+      <w:r>
+        <w:rPr>
+          <w:rFonts w:ascii="Cambria" w:hAnsi="Cambria"/>
+        </w:rPr>
+        <w:t xml:space="preserve"> files will contain the </w:t>
+      </w:r>
+      <w:r>
+        <w:rPr>
+          <w:rFonts w:ascii="Cambria" w:hAnsi="Cambria"/>
+        </w:rPr>
+        <w:t>transient waveform data and be much larger than the .</w:t>
+      </w:r>
+      <w:proofErr w:type="spellStart"/>
+      <w:r>
+        <w:rPr>
+          <w:rFonts w:ascii="Cambria" w:hAnsi="Cambria"/>
+        </w:rPr>
+        <w:t>cfg</w:t>
+      </w:r>
+      <w:proofErr w:type="spellEnd"/>
+      <w:r>
+        <w:rPr>
+          <w:rFonts w:ascii="Cambria" w:hAnsi="Cambria"/>
+        </w:rPr>
+        <w:t xml:space="preserve"> configuration files.  </w:t>
       </w:r>
     </w:p>
     <w:p>
@@ -622,12 +678,40 @@
         <w:rPr>
           <w:rFonts w:ascii="Cambria" w:hAnsi="Cambria" w:cs="Courier New"/>
         </w:rPr>
-        <w:t xml:space="preserve">.cfg and .dat files dumped into your local directory will share similar labeling to the original .pl4.  </w:t>
-      </w:r>
+        <w:t>.</w:t>
+      </w:r>
+      <w:proofErr w:type="spellStart"/>
       <w:r>
         <w:rPr>
           <w:rFonts w:ascii="Cambria" w:hAnsi="Cambria" w:cs="Courier New"/>
         </w:rPr>
+        <w:t>cfg</w:t>
+      </w:r>
+      <w:proofErr w:type="spellEnd"/>
+      <w:r>
+        <w:rPr>
+          <w:rFonts w:ascii="Cambria" w:hAnsi="Cambria" w:cs="Courier New"/>
+        </w:rPr>
+        <w:t xml:space="preserve"> and .</w:t>
+      </w:r>
+      <w:proofErr w:type="spellStart"/>
+      <w:r>
+        <w:rPr>
+          <w:rFonts w:ascii="Cambria" w:hAnsi="Cambria" w:cs="Courier New"/>
+        </w:rPr>
+        <w:t>dat</w:t>
+      </w:r>
+      <w:proofErr w:type="spellEnd"/>
+      <w:r>
+        <w:rPr>
+          <w:rFonts w:ascii="Cambria" w:hAnsi="Cambria" w:cs="Courier New"/>
+        </w:rPr>
+        <w:t xml:space="preserve"> files dumped into your local directory will share similar labeling to the original .pl4.  </w:t>
+      </w:r>
+      <w:r>
+        <w:rPr>
+          <w:rFonts w:ascii="Cambria" w:hAnsi="Cambria" w:cs="Courier New"/>
+        </w:rPr>
         <w:t xml:space="preserve">A successful conversion should </w:t>
       </w:r>
       <w:r>
@@ -640,7 +724,21 @@
         <w:rPr>
           <w:rFonts w:ascii="Cambria" w:hAnsi="Cambria" w:cs="Courier New"/>
         </w:rPr>
-        <w:t xml:space="preserve"> something similar to the following</w:t>
+        <w:t xml:space="preserve"> something </w:t>
+      </w:r>
+      <w:proofErr w:type="gramStart"/>
+      <w:r>
+        <w:rPr>
+          <w:rFonts w:ascii="Cambria" w:hAnsi="Cambria" w:cs="Courier New"/>
+        </w:rPr>
+        <w:t>similar to</w:t>
+      </w:r>
+      <w:proofErr w:type="gramEnd"/>
+      <w:r>
+        <w:rPr>
+          <w:rFonts w:ascii="Cambria" w:hAnsi="Cambria" w:cs="Courier New"/>
+        </w:rPr>
+        <w:t xml:space="preserve"> the following</w:t>
       </w:r>
       <w:r>
         <w:rPr>
@@ -830,13 +928,27 @@
         <w:rPr>
           <w:rFonts w:ascii="Cambria" w:hAnsi="Cambria"/>
         </w:rPr>
-        <w:t xml:space="preserve"> traditionally by using MATLAB</w:t>
-      </w:r>
-      <w:r>
-        <w:rPr>
-          <w:rFonts w:ascii="Cambria" w:hAnsi="Cambria"/>
-        </w:rPr>
-        <w:t>, however this process involves additional</w:t>
+        <w:t xml:space="preserve"> traditionally by using </w:t>
+      </w:r>
+      <w:proofErr w:type="gramStart"/>
+      <w:r>
+        <w:rPr>
+          <w:rFonts w:ascii="Cambria" w:hAnsi="Cambria"/>
+        </w:rPr>
+        <w:t>MATLAB</w:t>
+      </w:r>
+      <w:r>
+        <w:rPr>
+          <w:rFonts w:ascii="Cambria" w:hAnsi="Cambria"/>
+        </w:rPr>
+        <w:t>,</w:t>
+      </w:r>
+      <w:proofErr w:type="gramEnd"/>
+      <w:r>
+        <w:rPr>
+          <w:rFonts w:ascii="Cambria" w:hAnsi="Cambria"/>
+        </w:rPr>
+        <w:t xml:space="preserve"> however this process involves additional</w:t>
       </w:r>
       <w:r>
         <w:rPr>
@@ -890,7 +1002,14 @@
         <w:rPr>
           <w:rFonts w:ascii="Cambria" w:hAnsi="Cambria"/>
         </w:rPr>
-        <w:t>pythonic conversion process using only open</w:t>
+        <w:t xml:space="preserve">pythonic conversion process using only </w:t>
+      </w:r>
+      <w:proofErr w:type="gramStart"/>
+      <w:r>
+        <w:rPr>
+          <w:rFonts w:ascii="Cambria" w:hAnsi="Cambria"/>
+        </w:rPr>
+        <w:t>open</w:t>
       </w:r>
       <w:r>
         <w:rPr>
@@ -902,7 +1021,14 @@
         <w:rPr>
           <w:rFonts w:ascii="Cambria" w:hAnsi="Cambria"/>
         </w:rPr>
-        <w:t>source software</w:t>
+        <w:t>source</w:t>
+      </w:r>
+      <w:proofErr w:type="gramEnd"/>
+      <w:r>
+        <w:rPr>
+          <w:rFonts w:ascii="Cambria" w:hAnsi="Cambria"/>
+        </w:rPr>
+        <w:t xml:space="preserve"> software</w:t>
       </w:r>
       <w:r>
         <w:rPr>
@@ -1151,7 +1277,21 @@
         <w:rPr>
           <w:rFonts w:ascii="Cambria" w:hAnsi="Cambria"/>
         </w:rPr>
-        <w:t>, and upgrades to .mat version 6 using Octave. The resulting .mat files are stored in the local directory.</w:t>
+        <w:t xml:space="preserve">, and upgrades </w:t>
+      </w:r>
+      <w:proofErr w:type="gramStart"/>
+      <w:r>
+        <w:rPr>
+          <w:rFonts w:ascii="Cambria" w:hAnsi="Cambria"/>
+        </w:rPr>
+        <w:t>to .mat</w:t>
+      </w:r>
+      <w:proofErr w:type="gramEnd"/>
+      <w:r>
+        <w:rPr>
+          <w:rFonts w:ascii="Cambria" w:hAnsi="Cambria"/>
+        </w:rPr>
+        <w:t xml:space="preserve"> version 6 using Octave. The resulting .mat files are stored in the local directory.</w:t>
       </w:r>
     </w:p>
     <w:p>
@@ -1169,13 +1309,27 @@
         <w:rPr>
           <w:rFonts w:ascii="Cambria" w:hAnsi="Cambria"/>
         </w:rPr>
-        <w:t>Finally, the files may be compressed to</w:t>
-      </w:r>
-      <w:r>
-        <w:rPr>
-          <w:rFonts w:ascii="Cambria" w:hAnsi="Cambria"/>
-        </w:rPr>
-        <w:t xml:space="preserve"> .hdf5 </w:t>
+        <w:t xml:space="preserve">Finally, the files may be compressed </w:t>
+      </w:r>
+      <w:proofErr w:type="gramStart"/>
+      <w:r>
+        <w:rPr>
+          <w:rFonts w:ascii="Cambria" w:hAnsi="Cambria"/>
+        </w:rPr>
+        <w:t>to</w:t>
+      </w:r>
+      <w:r>
+        <w:rPr>
+          <w:rFonts w:ascii="Cambria" w:hAnsi="Cambria"/>
+        </w:rPr>
+        <w:t xml:space="preserve"> .hdf</w:t>
+      </w:r>
+      <w:proofErr w:type="gramEnd"/>
+      <w:r>
+        <w:rPr>
+          <w:rFonts w:ascii="Cambria" w:hAnsi="Cambria"/>
+        </w:rPr>
+        <w:t xml:space="preserve">5 </w:t>
       </w:r>
       <w:r>
         <w:rPr>
@@ -1286,7 +1440,21 @@
         <w:rPr>
           <w:rFonts w:ascii="Cambria" w:hAnsi="Cambria"/>
         </w:rPr>
-        <w:t xml:space="preserve">This package is similar to the </w:t>
+        <w:t xml:space="preserve">This package is </w:t>
+      </w:r>
+      <w:proofErr w:type="gramStart"/>
+      <w:r>
+        <w:rPr>
+          <w:rFonts w:ascii="Cambria" w:hAnsi="Cambria"/>
+        </w:rPr>
+        <w:t>similar to</w:t>
+      </w:r>
+      <w:proofErr w:type="gramEnd"/>
+      <w:r>
+        <w:rPr>
+          <w:rFonts w:ascii="Cambria" w:hAnsi="Cambria"/>
+        </w:rPr>
+        <w:t xml:space="preserve"> the </w:t>
       </w:r>
       <w:r>
         <w:rPr>
@@ -1427,6 +1595,512 @@
           <w:rFonts w:ascii="Cambria" w:hAnsi="Cambria"/>
         </w:rPr>
         <w:t>if necessary.</w:t>
+      </w:r>
+    </w:p>
+    <w:p>
+      <w:pPr>
+        <w:pStyle w:val="ListParagraph"/>
+        <w:numPr>
+          <w:ilvl w:val="0"/>
+          <w:numId w:val="1"/>
+        </w:numPr>
+        <w:rPr>
+          <w:rFonts w:ascii="Cambria" w:hAnsi="Cambria"/>
+        </w:rPr>
+      </w:pPr>
+      <w:r>
+        <w:rPr>
+          <w:rFonts w:ascii="Cambria" w:hAnsi="Cambria"/>
+        </w:rPr>
+        <w:t>COMTRADE to CSV file conversion:</w:t>
+      </w:r>
+    </w:p>
+    <w:p>
+      <w:pPr>
+        <w:ind w:left="360"/>
+        <w:rPr>
+          <w:rFonts w:ascii="Cambria" w:hAnsi="Cambria"/>
+        </w:rPr>
+      </w:pPr>
+      <w:r>
+        <w:rPr>
+          <w:rFonts w:ascii="Cambria" w:hAnsi="Cambria"/>
+        </w:rPr>
+        <w:t>A script to convert COMTRADE format to .csv has been added (comtrade_to_csv.py). This must be run after the .pl4 to COMTRADE conversion. Directory(</w:t>
+      </w:r>
+      <w:proofErr w:type="spellStart"/>
+      <w:r>
+        <w:rPr>
+          <w:rFonts w:ascii="Cambria" w:hAnsi="Cambria"/>
+        </w:rPr>
+        <w:t>ies</w:t>
+      </w:r>
+      <w:proofErr w:type="spellEnd"/>
+      <w:r>
+        <w:rPr>
+          <w:rFonts w:ascii="Cambria" w:hAnsi="Cambria"/>
+        </w:rPr>
+        <w:t>) and/or filename(s) may be entered from command line input or defaults may be adjusted directly in the code. Current default is to search for COMTRADE files in the same directory as the script.</w:t>
+      </w:r>
+    </w:p>
+    <w:p>
+      <w:pPr>
+        <w:pStyle w:val="ListParagraph"/>
+        <w:numPr>
+          <w:ilvl w:val="0"/>
+          <w:numId w:val="1"/>
+        </w:numPr>
+        <w:rPr>
+          <w:rFonts w:ascii="Cambria" w:hAnsi="Cambria"/>
+        </w:rPr>
+      </w:pPr>
+      <w:r>
+        <w:rPr>
+          <w:rFonts w:ascii="Cambria" w:hAnsi="Cambria"/>
+        </w:rPr>
+        <w:t xml:space="preserve">Compressed </w:t>
+      </w:r>
+      <w:proofErr w:type="spellStart"/>
+      <w:r>
+        <w:rPr>
+          <w:rFonts w:ascii="Cambria" w:hAnsi="Cambria"/>
+        </w:rPr>
+        <w:t>numpy</w:t>
+      </w:r>
+      <w:proofErr w:type="spellEnd"/>
+      <w:r>
+        <w:rPr>
+          <w:rFonts w:ascii="Cambria" w:hAnsi="Cambria"/>
+        </w:rPr>
+        <w:t xml:space="preserve"> file (.</w:t>
+      </w:r>
+      <w:proofErr w:type="spellStart"/>
+      <w:r>
+        <w:rPr>
+          <w:rFonts w:ascii="Cambria" w:hAnsi="Cambria"/>
+        </w:rPr>
+        <w:t>npz</w:t>
+      </w:r>
+      <w:proofErr w:type="spellEnd"/>
+      <w:r>
+        <w:rPr>
+          <w:rFonts w:ascii="Cambria" w:hAnsi="Cambria"/>
+        </w:rPr>
+        <w:t>) generation:</w:t>
+      </w:r>
+    </w:p>
+    <w:p>
+      <w:pPr>
+        <w:ind w:left="360"/>
+        <w:rPr>
+          <w:rFonts w:ascii="Cambria" w:hAnsi="Cambria"/>
+        </w:rPr>
+      </w:pPr>
+      <w:r>
+        <w:rPr>
+          <w:rFonts w:ascii="Cambria" w:hAnsi="Cambria"/>
+        </w:rPr>
+        <w:t>The CNN training algorithm is designed to read in a compressed .</w:t>
+      </w:r>
+      <w:proofErr w:type="spellStart"/>
+      <w:r>
+        <w:rPr>
+          <w:rFonts w:ascii="Cambria" w:hAnsi="Cambria"/>
+        </w:rPr>
+        <w:t>npz</w:t>
+      </w:r>
+      <w:proofErr w:type="spellEnd"/>
+      <w:r>
+        <w:rPr>
+          <w:rFonts w:ascii="Cambria" w:hAnsi="Cambria"/>
+        </w:rPr>
+        <w:t xml:space="preserve"> file with labels for each event and data (including voltage and currents for all phases). The script gen_npz.py </w:t>
+      </w:r>
+      <w:r>
+        <w:rPr>
+          <w:rFonts w:ascii="Cambria" w:hAnsi="Cambria"/>
+        </w:rPr>
+        <w:t xml:space="preserve">converts </w:t>
+      </w:r>
+      <w:proofErr w:type="gramStart"/>
+      <w:r>
+        <w:rPr>
+          <w:rFonts w:ascii="Cambria" w:hAnsi="Cambria"/>
+        </w:rPr>
+        <w:t>a .mat</w:t>
+      </w:r>
+      <w:proofErr w:type="gramEnd"/>
+      <w:r>
+        <w:rPr>
+          <w:rFonts w:ascii="Cambria" w:hAnsi="Cambria"/>
+        </w:rPr>
+        <w:t xml:space="preserve"> format (so gen_con_matfiles.py must be run first) to a .</w:t>
+      </w:r>
+      <w:proofErr w:type="spellStart"/>
+      <w:r>
+        <w:rPr>
+          <w:rFonts w:ascii="Cambria" w:hAnsi="Cambria"/>
+        </w:rPr>
+        <w:t>npz</w:t>
+      </w:r>
+      <w:proofErr w:type="spellEnd"/>
+      <w:r>
+        <w:rPr>
+          <w:rFonts w:ascii="Cambria" w:hAnsi="Cambria"/>
+        </w:rPr>
+        <w:t xml:space="preserve"> file. This selects only currents and voltages to save (additional data will be ignored). The .</w:t>
+      </w:r>
+      <w:proofErr w:type="spellStart"/>
+      <w:r>
+        <w:rPr>
+          <w:rFonts w:ascii="Cambria" w:hAnsi="Cambria"/>
+        </w:rPr>
+        <w:t>npz</w:t>
+      </w:r>
+      <w:proofErr w:type="spellEnd"/>
+      <w:r>
+        <w:rPr>
+          <w:rFonts w:ascii="Cambria" w:hAnsi="Cambria"/>
+        </w:rPr>
+        <w:t xml:space="preserve"> file contains an array for labels, an array for data, as well as arrays for phase and bus (the latter two are presently unused in the CNN algorithm). This script also:</w:t>
+      </w:r>
+    </w:p>
+    <w:p>
+      <w:pPr>
+        <w:pStyle w:val="ListParagraph"/>
+        <w:numPr>
+          <w:ilvl w:val="0"/>
+          <w:numId w:val="6"/>
+        </w:numPr>
+        <w:rPr>
+          <w:rFonts w:ascii="Cambria" w:hAnsi="Cambria"/>
+        </w:rPr>
+      </w:pPr>
+      <w:r>
+        <w:rPr>
+          <w:rFonts w:ascii="Cambria" w:hAnsi="Cambria"/>
+        </w:rPr>
+        <w:t>Culls the beginning time window (assuming extra time is padded) to ensure 0.4s are saved.</w:t>
+      </w:r>
+    </w:p>
+    <w:p>
+      <w:pPr>
+        <w:pStyle w:val="ListParagraph"/>
+        <w:numPr>
+          <w:ilvl w:val="0"/>
+          <w:numId w:val="6"/>
+        </w:numPr>
+        <w:rPr>
+          <w:rFonts w:ascii="Cambria" w:hAnsi="Cambria"/>
+        </w:rPr>
+      </w:pPr>
+      <w:r>
+        <w:rPr>
+          <w:rFonts w:ascii="Cambria" w:hAnsi="Cambria"/>
+        </w:rPr>
+        <w:t>Scales the voltages and currents to per-unit values. This accepts nominal voltage and power values to set scaling. If none are provided, the code estimates scales based on the pre-event data.</w:t>
+      </w:r>
+    </w:p>
+    <w:p>
+      <w:pPr>
+        <w:ind w:left="360"/>
+        <w:rPr>
+          <w:rFonts w:ascii="Cambria" w:hAnsi="Cambria"/>
+        </w:rPr>
+      </w:pPr>
+      <w:r>
+        <w:rPr>
+          <w:rFonts w:ascii="Cambria" w:hAnsi="Cambria"/>
+        </w:rPr>
+        <w:t>There are two main functions:</w:t>
+      </w:r>
+    </w:p>
+    <w:p>
+      <w:pPr>
+        <w:pStyle w:val="ListParagraph"/>
+        <w:numPr>
+          <w:ilvl w:val="0"/>
+          <w:numId w:val="7"/>
+        </w:numPr>
+        <w:rPr>
+          <w:rFonts w:ascii="Cambria" w:hAnsi="Cambria"/>
+        </w:rPr>
+      </w:pPr>
+      <w:proofErr w:type="spellStart"/>
+      <w:r>
+        <w:rPr>
+          <w:rFonts w:ascii="Courier New" w:hAnsi="Courier New" w:cs="Courier New"/>
+        </w:rPr>
+        <w:lastRenderedPageBreak/>
+        <w:t>execute_gen_npz</w:t>
+      </w:r>
+      <w:proofErr w:type="spellEnd"/>
+      <w:r>
+        <w:rPr>
+          <w:rFonts w:ascii="Cambria" w:hAnsi="Cambria"/>
+        </w:rPr>
+        <w:t>:</w:t>
+      </w:r>
+      <w:r>
+        <w:rPr>
+          <w:rFonts w:ascii="Cambria" w:hAnsi="Cambria"/>
+        </w:rPr>
+        <w:t xml:space="preserve"> accepts custom file paths and feeder names (IEEE13 is default). This will convert fault and no-fault data from the AtpLoopFaults_all_feeders_PV.py script. </w:t>
+      </w:r>
+    </w:p>
+    <w:p>
+      <w:pPr>
+        <w:pStyle w:val="ListParagraph"/>
+        <w:numPr>
+          <w:ilvl w:val="0"/>
+          <w:numId w:val="7"/>
+        </w:numPr>
+        <w:rPr>
+          <w:rFonts w:ascii="Cambria" w:hAnsi="Cambria"/>
+        </w:rPr>
+      </w:pPr>
+      <w:proofErr w:type="spellStart"/>
+      <w:r>
+        <w:rPr>
+          <w:rFonts w:ascii="Courier New" w:hAnsi="Courier New" w:cs="Courier New"/>
+        </w:rPr>
+        <w:t>atpdraw_gen_npz</w:t>
+      </w:r>
+      <w:proofErr w:type="spellEnd"/>
+      <w:r>
+        <w:rPr>
+          <w:rFonts w:ascii="Cambria" w:hAnsi="Cambria"/>
+        </w:rPr>
+        <w:t xml:space="preserve">: also accepts custom file paths and feeder names (IEEE13 default). Has a few additional entry options. This will covert voltage sag events </w:t>
+      </w:r>
+      <w:r>
+        <w:rPr>
+          <w:rFonts w:ascii="Cambria" w:hAnsi="Cambria"/>
+        </w:rPr>
+        <w:t xml:space="preserve">generated with the </w:t>
+      </w:r>
+      <w:proofErr w:type="spellStart"/>
+      <w:r>
+        <w:rPr>
+          <w:rFonts w:ascii="Cambria" w:hAnsi="Cambria"/>
+        </w:rPr>
+        <w:t>ATPDraw</w:t>
+      </w:r>
+      <w:proofErr w:type="spellEnd"/>
+      <w:r>
+        <w:rPr>
+          <w:rFonts w:ascii="Cambria" w:hAnsi="Cambria"/>
+        </w:rPr>
+        <w:t xml:space="preserve"> script in the </w:t>
+      </w:r>
+      <w:proofErr w:type="spellStart"/>
+      <w:r>
+        <w:rPr>
+          <w:rFonts w:ascii="Cambria" w:hAnsi="Cambria"/>
+        </w:rPr>
+        <w:t>atpdraw</w:t>
+      </w:r>
+      <w:proofErr w:type="spellEnd"/>
+      <w:r>
+        <w:rPr>
+          <w:rFonts w:ascii="Cambria" w:hAnsi="Cambria"/>
+        </w:rPr>
+        <w:t xml:space="preserve"> folder of the repo “</w:t>
+      </w:r>
+      <w:hyperlink r:id="rId10" w:history="1">
+        <w:r>
+          <w:rPr>
+            <w:rStyle w:val="Hyperlink"/>
+            <w:rFonts w:ascii="Cambria" w:hAnsi="Cambria"/>
+          </w:rPr>
+          <w:t>Event detection for field data</w:t>
+        </w:r>
+      </w:hyperlink>
+      <w:r>
+        <w:rPr>
+          <w:rFonts w:ascii="Cambria" w:hAnsi="Cambria"/>
+        </w:rPr>
+        <w:t xml:space="preserve">.” This is intended to be run after </w:t>
+      </w:r>
+      <w:proofErr w:type="spellStart"/>
+      <w:proofErr w:type="gramStart"/>
+      <w:r>
+        <w:rPr>
+          <w:rFonts w:ascii="Cambria" w:hAnsi="Cambria"/>
+        </w:rPr>
+        <w:t>execute</w:t>
+      </w:r>
+      <w:proofErr w:type="gramEnd"/>
+      <w:r>
+        <w:rPr>
+          <w:rFonts w:ascii="Cambria" w:hAnsi="Cambria"/>
+        </w:rPr>
+        <w:t>_gen_npz</w:t>
+      </w:r>
+      <w:proofErr w:type="spellEnd"/>
+      <w:r>
+        <w:rPr>
+          <w:rFonts w:ascii="Cambria" w:hAnsi="Cambria"/>
+        </w:rPr>
+        <w:t xml:space="preserve"> and will add the sag events to an already created .</w:t>
+      </w:r>
+      <w:proofErr w:type="spellStart"/>
+      <w:r>
+        <w:rPr>
+          <w:rFonts w:ascii="Cambria" w:hAnsi="Cambria"/>
+        </w:rPr>
+        <w:t>npz</w:t>
+      </w:r>
+      <w:proofErr w:type="spellEnd"/>
+      <w:r>
+        <w:rPr>
+          <w:rFonts w:ascii="Cambria" w:hAnsi="Cambria"/>
+        </w:rPr>
+        <w:t xml:space="preserve"> file.</w:t>
+      </w:r>
+    </w:p>
+    <w:p>
+      <w:pPr>
+        <w:pStyle w:val="ListParagraph"/>
+        <w:ind w:left="1080"/>
+        <w:rPr>
+          <w:rFonts w:ascii="Cambria" w:hAnsi="Cambria"/>
+        </w:rPr>
+      </w:pPr>
+    </w:p>
+    <w:p>
+      <w:pPr>
+        <w:pStyle w:val="ListParagraph"/>
+        <w:numPr>
+          <w:ilvl w:val="0"/>
+          <w:numId w:val="1"/>
+        </w:numPr>
+        <w:rPr>
+          <w:rFonts w:ascii="Cambria" w:hAnsi="Cambria"/>
+        </w:rPr>
+      </w:pPr>
+      <w:r>
+        <w:rPr>
+          <w:rFonts w:ascii="Cambria" w:hAnsi="Cambria"/>
+        </w:rPr>
+        <w:t xml:space="preserve">Collect </w:t>
+      </w:r>
+      <w:proofErr w:type="spellStart"/>
+      <w:r>
+        <w:rPr>
+          <w:rFonts w:ascii="Cambria" w:hAnsi="Cambria"/>
+        </w:rPr>
+        <w:t>ATPDraw</w:t>
+      </w:r>
+      <w:proofErr w:type="spellEnd"/>
+      <w:r>
+        <w:rPr>
+          <w:rFonts w:ascii="Cambria" w:hAnsi="Cambria"/>
+        </w:rPr>
+        <w:t xml:space="preserve"> simulations:</w:t>
+      </w:r>
+    </w:p>
+    <w:p>
+      <w:pPr>
+        <w:ind w:left="360"/>
+        <w:rPr>
+          <w:rFonts w:ascii="Cambria" w:hAnsi="Cambria"/>
+        </w:rPr>
+      </w:pPr>
+      <w:r>
+        <w:rPr>
+          <w:rFonts w:ascii="Cambria" w:hAnsi="Cambria"/>
+        </w:rPr>
+        <w:t xml:space="preserve">ATP draw simulations must be run separately using </w:t>
+      </w:r>
+      <w:r>
+        <w:rPr>
+          <w:rFonts w:ascii="Cambria" w:hAnsi="Cambria"/>
+        </w:rPr>
+        <w:t xml:space="preserve">the </w:t>
+      </w:r>
+      <w:proofErr w:type="spellStart"/>
+      <w:r>
+        <w:rPr>
+          <w:rFonts w:ascii="Cambria" w:hAnsi="Cambria"/>
+        </w:rPr>
+        <w:t>ATPDraw</w:t>
+      </w:r>
+      <w:proofErr w:type="spellEnd"/>
+      <w:r>
+        <w:rPr>
+          <w:rFonts w:ascii="Cambria" w:hAnsi="Cambria"/>
+        </w:rPr>
+        <w:t xml:space="preserve"> script in the </w:t>
+      </w:r>
+      <w:proofErr w:type="spellStart"/>
+      <w:r>
+        <w:rPr>
+          <w:rFonts w:ascii="Cambria" w:hAnsi="Cambria"/>
+        </w:rPr>
+        <w:t>atpdraw</w:t>
+      </w:r>
+      <w:proofErr w:type="spellEnd"/>
+      <w:r>
+        <w:rPr>
+          <w:rFonts w:ascii="Cambria" w:hAnsi="Cambria"/>
+        </w:rPr>
+        <w:t xml:space="preserve"> folder of the repo “</w:t>
+      </w:r>
+      <w:hyperlink r:id="rId11" w:history="1">
+        <w:r>
+          <w:rPr>
+            <w:rStyle w:val="Hyperlink"/>
+            <w:rFonts w:ascii="Cambria" w:hAnsi="Cambria"/>
+          </w:rPr>
+          <w:t>Event detection for field data</w:t>
+        </w:r>
+      </w:hyperlink>
+      <w:r>
+        <w:rPr>
+          <w:rFonts w:ascii="Cambria" w:hAnsi="Cambria"/>
+        </w:rPr>
+        <w:t xml:space="preserve">.” </w:t>
+      </w:r>
+      <w:r>
+        <w:rPr>
+          <w:rFonts w:ascii="Cambria" w:hAnsi="Cambria"/>
+        </w:rPr>
+        <w:t xml:space="preserve">Once these are run, the script collect_atpdraw_sims.py will </w:t>
+      </w:r>
+      <w:r>
+        <w:rPr>
+          <w:rFonts w:ascii="Cambria" w:hAnsi="Cambria"/>
+        </w:rPr>
+        <w:t>find the files (paths are hard-coded in the script) and merge them with the .</w:t>
+      </w:r>
+      <w:proofErr w:type="spellStart"/>
+      <w:r>
+        <w:rPr>
+          <w:rFonts w:ascii="Cambria" w:hAnsi="Cambria"/>
+        </w:rPr>
+        <w:t>npz</w:t>
+      </w:r>
+      <w:proofErr w:type="spellEnd"/>
+      <w:r>
+        <w:rPr>
+          <w:rFonts w:ascii="Cambria" w:hAnsi="Cambria"/>
+        </w:rPr>
+        <w:t xml:space="preserve"> file using the </w:t>
+      </w:r>
+      <w:proofErr w:type="spellStart"/>
+      <w:r>
+        <w:rPr>
+          <w:rFonts w:ascii="Cambria" w:hAnsi="Cambria"/>
+        </w:rPr>
+        <w:t>atpdraw_gen_npz</w:t>
+      </w:r>
+      <w:proofErr w:type="spellEnd"/>
+      <w:r>
+        <w:rPr>
+          <w:rFonts w:ascii="Cambria" w:hAnsi="Cambria"/>
+        </w:rPr>
+        <w:t xml:space="preserve"> function in gen_npz.py</w:t>
       </w:r>
     </w:p>
     <w:p>
@@ -1498,7 +2172,21 @@
         <w:rPr>
           <w:rFonts w:ascii="Cambria" w:hAnsi="Cambria"/>
         </w:rPr>
-        <w:t xml:space="preserve"> transient data generation and conversion, the point-on-wave data can be used for any application. If the user in interested to use the data for fault identification and protection zone classification algorithm, then it’s essential to rearrange the data in a particular format along with the labels for supervised training. This section provides information about different variables that are available in the transient data file. When a user loads a data file (.pl4 or .mat or COMTRADE format), it contains </w:t>
+        <w:t xml:space="preserve"> transient data generation and conversion, the point-on-wave data can be used for any application. If the user in interested to use the data for fault identification and protection zone classification algorithm, then it’s essential to rearrange the data in a particular format along with the labels for supervised training. This section provides information about different variables that are available in the transient data file. When a user loads a data file (.pl4 </w:t>
+      </w:r>
+      <w:proofErr w:type="gramStart"/>
+      <w:r>
+        <w:rPr>
+          <w:rFonts w:ascii="Cambria" w:hAnsi="Cambria"/>
+        </w:rPr>
+        <w:t>or .mat</w:t>
+      </w:r>
+      <w:proofErr w:type="gramEnd"/>
+      <w:r>
+        <w:rPr>
+          <w:rFonts w:ascii="Cambria" w:hAnsi="Cambria"/>
+        </w:rPr>
+        <w:t xml:space="preserve"> or COMTRADE format), it contains </w:t>
       </w:r>
     </w:p>
     <w:p>
@@ -1512,13 +2200,41 @@
           <w:rFonts w:ascii="Cambria" w:hAnsi="Cambria"/>
         </w:rPr>
       </w:pPr>
-      <w:r>
-        <w:rPr>
-          <w:rFonts w:ascii="Cambria" w:hAnsi="Cambria"/>
-          <w:i/>
-          <w:iCs/>
-        </w:rPr>
-        <w:t xml:space="preserve">vSBUS_A, vSBUS_B </w:t>
+      <w:proofErr w:type="spellStart"/>
+      <w:r>
+        <w:rPr>
+          <w:rFonts w:ascii="Cambria" w:hAnsi="Cambria"/>
+          <w:i/>
+          <w:iCs/>
+        </w:rPr>
+        <w:t>vSBUS_A</w:t>
+      </w:r>
+      <w:proofErr w:type="spellEnd"/>
+      <w:r>
+        <w:rPr>
+          <w:rFonts w:ascii="Cambria" w:hAnsi="Cambria"/>
+          <w:i/>
+          <w:iCs/>
+        </w:rPr>
+        <w:t xml:space="preserve">, </w:t>
+      </w:r>
+      <w:proofErr w:type="spellStart"/>
+      <w:r>
+        <w:rPr>
+          <w:rFonts w:ascii="Cambria" w:hAnsi="Cambria"/>
+          <w:i/>
+          <w:iCs/>
+        </w:rPr>
+        <w:t>vSBUS_B</w:t>
+      </w:r>
+      <w:proofErr w:type="spellEnd"/>
+      <w:r>
+        <w:rPr>
+          <w:rFonts w:ascii="Cambria" w:hAnsi="Cambria"/>
+          <w:i/>
+          <w:iCs/>
+        </w:rPr>
+        <w:t xml:space="preserve"> </w:t>
       </w:r>
       <w:r>
         <w:rPr>
@@ -1532,7 +2248,25 @@
           <w:i/>
           <w:iCs/>
         </w:rPr>
-        <w:t xml:space="preserve"> vSBUS_C </w:t>
+        <w:t xml:space="preserve"> </w:t>
+      </w:r>
+      <w:proofErr w:type="spellStart"/>
+      <w:r>
+        <w:rPr>
+          <w:rFonts w:ascii="Cambria" w:hAnsi="Cambria"/>
+          <w:i/>
+          <w:iCs/>
+        </w:rPr>
+        <w:t>vSBUS_C</w:t>
+      </w:r>
+      <w:proofErr w:type="spellEnd"/>
+      <w:r>
+        <w:rPr>
+          <w:rFonts w:ascii="Cambria" w:hAnsi="Cambria"/>
+          <w:i/>
+          <w:iCs/>
+        </w:rPr>
+        <w:t xml:space="preserve"> </w:t>
       </w:r>
       <w:r>
         <w:rPr>
@@ -1944,7 +2678,6 @@
           <w:i/>
           <w:iCs/>
         </w:rPr>
-        <w:lastRenderedPageBreak/>
         <w:t>iTACS__PV001</w:t>
       </w:r>
       <w:r>
@@ -2454,7 +3187,7 @@
         <w:sz w:val="24"/>
       </w:rPr>
     </w:lvl>
-    <w:lvl w:ilvl="1" w:tplc="04090019" w:tentative="1">
+    <w:lvl w:ilvl="1" w:tplc="04090019">
       <w:start w:val="1"/>
       <w:numFmt w:val="lowerLetter"/>
       <w:lvlText w:val="%2."/>
@@ -2525,6 +3258,205 @@
       <w:pPr>
         <w:ind w:left="6480" w:hanging="180"/>
       </w:pPr>
+    </w:lvl>
+  </w:abstractNum>
+  <w:abstractNum w:abstractNumId="5" w15:restartNumberingAfterBreak="0">
+    <w:nsid w:val="665C1C60"/>
+    <w:multiLevelType w:val="hybridMultilevel"/>
+    <w:tmpl w:val="91142DD6"/>
+    <w:lvl w:ilvl="0" w:tplc="0409000F">
+      <w:start w:val="1"/>
+      <w:numFmt w:val="decimal"/>
+      <w:lvlText w:val="%1."/>
+      <w:lvlJc w:val="left"/>
+      <w:pPr>
+        <w:ind w:left="1080" w:hanging="360"/>
+      </w:pPr>
+    </w:lvl>
+    <w:lvl w:ilvl="1" w:tplc="04090019" w:tentative="1">
+      <w:start w:val="1"/>
+      <w:numFmt w:val="lowerLetter"/>
+      <w:lvlText w:val="%2."/>
+      <w:lvlJc w:val="left"/>
+      <w:pPr>
+        <w:ind w:left="1800" w:hanging="360"/>
+      </w:pPr>
+    </w:lvl>
+    <w:lvl w:ilvl="2" w:tplc="0409001B" w:tentative="1">
+      <w:start w:val="1"/>
+      <w:numFmt w:val="lowerRoman"/>
+      <w:lvlText w:val="%3."/>
+      <w:lvlJc w:val="right"/>
+      <w:pPr>
+        <w:ind w:left="2520" w:hanging="180"/>
+      </w:pPr>
+    </w:lvl>
+    <w:lvl w:ilvl="3" w:tplc="0409000F" w:tentative="1">
+      <w:start w:val="1"/>
+      <w:numFmt w:val="decimal"/>
+      <w:lvlText w:val="%4."/>
+      <w:lvlJc w:val="left"/>
+      <w:pPr>
+        <w:ind w:left="3240" w:hanging="360"/>
+      </w:pPr>
+    </w:lvl>
+    <w:lvl w:ilvl="4" w:tplc="04090019" w:tentative="1">
+      <w:start w:val="1"/>
+      <w:numFmt w:val="lowerLetter"/>
+      <w:lvlText w:val="%5."/>
+      <w:lvlJc w:val="left"/>
+      <w:pPr>
+        <w:ind w:left="3960" w:hanging="360"/>
+      </w:pPr>
+    </w:lvl>
+    <w:lvl w:ilvl="5" w:tplc="0409001B" w:tentative="1">
+      <w:start w:val="1"/>
+      <w:numFmt w:val="lowerRoman"/>
+      <w:lvlText w:val="%6."/>
+      <w:lvlJc w:val="right"/>
+      <w:pPr>
+        <w:ind w:left="4680" w:hanging="180"/>
+      </w:pPr>
+    </w:lvl>
+    <w:lvl w:ilvl="6" w:tplc="0409000F" w:tentative="1">
+      <w:start w:val="1"/>
+      <w:numFmt w:val="decimal"/>
+      <w:lvlText w:val="%7."/>
+      <w:lvlJc w:val="left"/>
+      <w:pPr>
+        <w:ind w:left="5400" w:hanging="360"/>
+      </w:pPr>
+    </w:lvl>
+    <w:lvl w:ilvl="7" w:tplc="04090019" w:tentative="1">
+      <w:start w:val="1"/>
+      <w:numFmt w:val="lowerLetter"/>
+      <w:lvlText w:val="%8."/>
+      <w:lvlJc w:val="left"/>
+      <w:pPr>
+        <w:ind w:left="6120" w:hanging="360"/>
+      </w:pPr>
+    </w:lvl>
+    <w:lvl w:ilvl="8" w:tplc="0409001B" w:tentative="1">
+      <w:start w:val="1"/>
+      <w:numFmt w:val="lowerRoman"/>
+      <w:lvlText w:val="%9."/>
+      <w:lvlJc w:val="right"/>
+      <w:pPr>
+        <w:ind w:left="6840" w:hanging="180"/>
+      </w:pPr>
+    </w:lvl>
+  </w:abstractNum>
+  <w:abstractNum w:abstractNumId="6" w15:restartNumberingAfterBreak="0">
+    <w:nsid w:val="6F8C2CCB"/>
+    <w:multiLevelType w:val="hybridMultilevel"/>
+    <w:tmpl w:val="69847134"/>
+    <w:lvl w:ilvl="0" w:tplc="04090001">
+      <w:start w:val="1"/>
+      <w:numFmt w:val="bullet"/>
+      <w:lvlText w:val=""/>
+      <w:lvlJc w:val="left"/>
+      <w:pPr>
+        <w:ind w:left="1080" w:hanging="360"/>
+      </w:pPr>
+      <w:rPr>
+        <w:rFonts w:ascii="Symbol" w:hAnsi="Symbol" w:hint="default"/>
+      </w:rPr>
+    </w:lvl>
+    <w:lvl w:ilvl="1" w:tplc="04090003" w:tentative="1">
+      <w:start w:val="1"/>
+      <w:numFmt w:val="bullet"/>
+      <w:lvlText w:val="o"/>
+      <w:lvlJc w:val="left"/>
+      <w:pPr>
+        <w:ind w:left="1800" w:hanging="360"/>
+      </w:pPr>
+      <w:rPr>
+        <w:rFonts w:ascii="Courier New" w:hAnsi="Courier New" w:cs="Courier New" w:hint="default"/>
+      </w:rPr>
+    </w:lvl>
+    <w:lvl w:ilvl="2" w:tplc="04090005" w:tentative="1">
+      <w:start w:val="1"/>
+      <w:numFmt w:val="bullet"/>
+      <w:lvlText w:val=""/>
+      <w:lvlJc w:val="left"/>
+      <w:pPr>
+        <w:ind w:left="2520" w:hanging="360"/>
+      </w:pPr>
+      <w:rPr>
+        <w:rFonts w:ascii="Wingdings" w:hAnsi="Wingdings" w:hint="default"/>
+      </w:rPr>
+    </w:lvl>
+    <w:lvl w:ilvl="3" w:tplc="04090001" w:tentative="1">
+      <w:start w:val="1"/>
+      <w:numFmt w:val="bullet"/>
+      <w:lvlText w:val=""/>
+      <w:lvlJc w:val="left"/>
+      <w:pPr>
+        <w:ind w:left="3240" w:hanging="360"/>
+      </w:pPr>
+      <w:rPr>
+        <w:rFonts w:ascii="Symbol" w:hAnsi="Symbol" w:hint="default"/>
+      </w:rPr>
+    </w:lvl>
+    <w:lvl w:ilvl="4" w:tplc="04090003" w:tentative="1">
+      <w:start w:val="1"/>
+      <w:numFmt w:val="bullet"/>
+      <w:lvlText w:val="o"/>
+      <w:lvlJc w:val="left"/>
+      <w:pPr>
+        <w:ind w:left="3960" w:hanging="360"/>
+      </w:pPr>
+      <w:rPr>
+        <w:rFonts w:ascii="Courier New" w:hAnsi="Courier New" w:cs="Courier New" w:hint="default"/>
+      </w:rPr>
+    </w:lvl>
+    <w:lvl w:ilvl="5" w:tplc="04090005" w:tentative="1">
+      <w:start w:val="1"/>
+      <w:numFmt w:val="bullet"/>
+      <w:lvlText w:val=""/>
+      <w:lvlJc w:val="left"/>
+      <w:pPr>
+        <w:ind w:left="4680" w:hanging="360"/>
+      </w:pPr>
+      <w:rPr>
+        <w:rFonts w:ascii="Wingdings" w:hAnsi="Wingdings" w:hint="default"/>
+      </w:rPr>
+    </w:lvl>
+    <w:lvl w:ilvl="6" w:tplc="04090001" w:tentative="1">
+      <w:start w:val="1"/>
+      <w:numFmt w:val="bullet"/>
+      <w:lvlText w:val=""/>
+      <w:lvlJc w:val="left"/>
+      <w:pPr>
+        <w:ind w:left="5400" w:hanging="360"/>
+      </w:pPr>
+      <w:rPr>
+        <w:rFonts w:ascii="Symbol" w:hAnsi="Symbol" w:hint="default"/>
+      </w:rPr>
+    </w:lvl>
+    <w:lvl w:ilvl="7" w:tplc="04090003" w:tentative="1">
+      <w:start w:val="1"/>
+      <w:numFmt w:val="bullet"/>
+      <w:lvlText w:val="o"/>
+      <w:lvlJc w:val="left"/>
+      <w:pPr>
+        <w:ind w:left="6120" w:hanging="360"/>
+      </w:pPr>
+      <w:rPr>
+        <w:rFonts w:ascii="Courier New" w:hAnsi="Courier New" w:cs="Courier New" w:hint="default"/>
+      </w:rPr>
+    </w:lvl>
+    <w:lvl w:ilvl="8" w:tplc="04090005" w:tentative="1">
+      <w:start w:val="1"/>
+      <w:numFmt w:val="bullet"/>
+      <w:lvlText w:val=""/>
+      <w:lvlJc w:val="left"/>
+      <w:pPr>
+        <w:ind w:left="6840" w:hanging="360"/>
+      </w:pPr>
+      <w:rPr>
+        <w:rFonts w:ascii="Wingdings" w:hAnsi="Wingdings" w:hint="default"/>
+      </w:rPr>
     </w:lvl>
   </w:abstractNum>
   <w:num w:numId="1" w16cid:durableId="956638940">
@@ -2541,6 +3473,12 @@
   </w:num>
   <w:num w:numId="5" w16cid:durableId="2015299488">
     <w:abstractNumId w:val="2"/>
+  </w:num>
+  <w:num w:numId="6" w16cid:durableId="1472625845">
+    <w:abstractNumId w:val="6"/>
+  </w:num>
+  <w:num w:numId="7" w16cid:durableId="1557937842">
+    <w:abstractNumId w:val="5"/>
   </w:num>
 </w:numbering>
 </file>

</xml_diff>